<commit_message>
fix: sesuaikan posisi tanggal di atas bendahara dan hapus seksi parkir sesuai template word baru
</commit_message>
<xml_diff>
--- a/format-new-pemasaran (1).docx
+++ b/format-new-pemasaran (1).docx
@@ -1164,617 +1164,6 @@
                 <w:lang w:val="en-US"/>
               </w:rPr>
               <w:t>0</w:t>
-            </w:r>
-          </w:p>
-        </w:tc>
-      </w:tr>
-      <w:tr>
-        <w:trPr>
-          <w:trHeight w:val="321"/>
-        </w:trPr>
-        <w:tc>
-          <w:tcPr>
-            <w:tcW w:w="10120" w:type="dxa"/>
-            <w:gridSpan w:val="4"/>
-            <w:vAlign w:val="bottom"/>
-          </w:tcPr>
-          <w:p>
-            <w:pPr>
-              <w:spacing w:line="0" w:lineRule="atLeast"/>
-              <w:ind w:right="10"/>
-              <w:rPr>
-                <w:rFonts w:ascii="Arial" w:eastAsia="Arial" w:hAnsi="Arial"/>
-                <w:sz w:val="18"/>
-              </w:rPr>
-            </w:pPr>
-            <w:r>
-              <w:rPr>
-                <w:rFonts w:ascii="Arial" w:eastAsia="Arial" w:hAnsi="Arial"/>
-                <w:b/>
-                <w:bCs/>
-                <w:sz w:val="18"/>
-                <w:lang w:val="en-US"/>
-              </w:rPr>
-              <w:t xml:space="preserve">4.1.02.02.14.0001  </w:t>
-            </w:r>
-            <w:r>
-              <w:rPr>
-                <w:rFonts w:ascii="Arial" w:eastAsia="Arial" w:hAnsi="Arial"/>
-                <w:b/>
-                <w:bCs/>
-                <w:sz w:val="18"/>
-                <w:lang w:val="en-US"/>
-              </w:rPr>
-              <w:t>Retribusi Penyediaan Tempat Khusus Parkir Di Luar Badan Jalan</w:t>
-            </w:r>
-          </w:p>
-        </w:tc>
-      </w:tr>
-      <w:tr>
-        <w:trPr>
-          <w:trHeight w:val="321"/>
-        </w:trPr>
-        <w:tc>
-          <w:tcPr>
-            <w:tcW w:w="480" w:type="dxa"/>
-            <w:vAlign w:val="bottom"/>
-          </w:tcPr>
-          <w:p>
-            <w:pPr>
-              <w:spacing w:line="0" w:lineRule="atLeast"/>
-              <w:jc w:val="right"/>
-              <w:rPr>
-                <w:rFonts w:ascii="Arial" w:eastAsia="Arial" w:hAnsi="Arial"/>
-                <w:sz w:val="18"/>
-              </w:rPr>
-            </w:pPr>
-            <w:r>
-              <w:rPr>
-                <w:rFonts w:ascii="Arial" w:eastAsia="Arial" w:hAnsi="Arial"/>
-                <w:sz w:val="18"/>
-              </w:rPr>
-              <w:t>21.</w:t>
-            </w:r>
-          </w:p>
-        </w:tc>
-        <w:tc>
-          <w:tcPr>
-            <w:tcW w:w="5720" w:type="dxa"/>
-            <w:vAlign w:val="bottom"/>
-          </w:tcPr>
-          <w:p>
-            <w:pPr>
-              <w:spacing w:line="0" w:lineRule="atLeast"/>
-              <w:ind w:left="60"/>
-              <w:rPr>
-                <w:rFonts w:ascii="Arial" w:eastAsia="Arial" w:hAnsi="Arial"/>
-                <w:sz w:val="18"/>
-                <w:lang w:val="en-US"/>
-              </w:rPr>
-            </w:pPr>
-            <w:r>
-              <w:rPr>
-                <w:rFonts w:ascii="Arial" w:eastAsia="Arial" w:hAnsi="Arial"/>
-                <w:sz w:val="18"/>
-              </w:rPr>
-              <w:t>Golongan I</w:t>
-            </w:r>
-            <w:r>
-              <w:rPr>
-                <w:rFonts w:ascii="Arial" w:eastAsia="Arial" w:hAnsi="Arial"/>
-                <w:sz w:val="18"/>
-                <w:lang w:val="en-US"/>
-              </w:rPr>
-              <w:t xml:space="preserve"> (Bus Besar, Truk Besar, dan Mobil Box Besar)</w:t>
-            </w:r>
-          </w:p>
-        </w:tc>
-        <w:tc>
-          <w:tcPr>
-            <w:tcW w:w="1360" w:type="dxa"/>
-            <w:vAlign w:val="bottom"/>
-          </w:tcPr>
-          <w:p>
-            <w:pPr>
-              <w:spacing w:line="0" w:lineRule="atLeast"/>
-              <w:ind w:left="1060"/>
-              <w:rPr>
-                <w:rFonts w:ascii="Arial" w:eastAsia="Arial" w:hAnsi="Arial"/>
-                <w:w w:val="99"/>
-                <w:sz w:val="18"/>
-              </w:rPr>
-            </w:pPr>
-            <w:r>
-              <w:rPr>
-                <w:rFonts w:ascii="Arial" w:eastAsia="Arial" w:hAnsi="Arial"/>
-                <w:w w:val="99"/>
-                <w:sz w:val="18"/>
-              </w:rPr>
-              <w:t>Rp.</w:t>
-            </w:r>
-          </w:p>
-        </w:tc>
-        <w:tc>
-          <w:tcPr>
-            <w:tcW w:w="2560" w:type="dxa"/>
-            <w:vAlign w:val="bottom"/>
-          </w:tcPr>
-          <w:p>
-            <w:pPr>
-              <w:spacing w:line="0" w:lineRule="atLeast"/>
-              <w:ind w:right="10"/>
-              <w:jc w:val="right"/>
-              <w:rPr>
-                <w:rFonts w:ascii="Arial" w:eastAsia="Arial" w:hAnsi="Arial"/>
-                <w:sz w:val="18"/>
-              </w:rPr>
-            </w:pPr>
-            <w:r>
-              <w:rPr>
-                <w:rFonts w:ascii="Arial" w:eastAsia="Arial" w:hAnsi="Arial"/>
-                <w:sz w:val="18"/>
-              </w:rPr>
-              <w:t>0</w:t>
-            </w:r>
-          </w:p>
-        </w:tc>
-      </w:tr>
-      <w:tr>
-        <w:trPr>
-          <w:trHeight w:val="321"/>
-        </w:trPr>
-        <w:tc>
-          <w:tcPr>
-            <w:tcW w:w="480" w:type="dxa"/>
-            <w:vAlign w:val="bottom"/>
-          </w:tcPr>
-          <w:p>
-            <w:pPr>
-              <w:spacing w:line="0" w:lineRule="atLeast"/>
-              <w:jc w:val="right"/>
-              <w:rPr>
-                <w:rFonts w:ascii="Arial" w:eastAsia="Arial" w:hAnsi="Arial"/>
-                <w:sz w:val="18"/>
-              </w:rPr>
-            </w:pPr>
-            <w:r>
-              <w:rPr>
-                <w:rFonts w:ascii="Arial" w:eastAsia="Arial" w:hAnsi="Arial"/>
-                <w:sz w:val="18"/>
-              </w:rPr>
-              <w:t>22.</w:t>
-            </w:r>
-          </w:p>
-        </w:tc>
-        <w:tc>
-          <w:tcPr>
-            <w:tcW w:w="5720" w:type="dxa"/>
-            <w:vAlign w:val="bottom"/>
-          </w:tcPr>
-          <w:p>
-            <w:pPr>
-              <w:spacing w:line="0" w:lineRule="atLeast"/>
-              <w:ind w:left="60"/>
-              <w:rPr>
-                <w:rFonts w:ascii="Arial" w:eastAsia="Arial" w:hAnsi="Arial"/>
-                <w:sz w:val="18"/>
-              </w:rPr>
-            </w:pPr>
-            <w:r>
-              <w:rPr>
-                <w:rFonts w:ascii="Arial" w:eastAsia="Arial" w:hAnsi="Arial"/>
-                <w:sz w:val="18"/>
-              </w:rPr>
-              <w:t>Golongan I</w:t>
-            </w:r>
-            <w:r>
-              <w:rPr>
-                <w:rFonts w:ascii="Arial" w:eastAsia="Arial" w:hAnsi="Arial"/>
-                <w:sz w:val="18"/>
-                <w:lang w:val="en-US"/>
-              </w:rPr>
-              <w:t>I</w:t>
-            </w:r>
-            <w:r>
-              <w:rPr>
-                <w:rFonts w:ascii="Arial" w:eastAsia="Arial" w:hAnsi="Arial"/>
-                <w:sz w:val="18"/>
-                <w:lang w:val="en-US"/>
-              </w:rPr>
-              <w:t xml:space="preserve"> (Bus Kecil,Truk Kecil</w:t>
-            </w:r>
-            <w:r>
-              <w:rPr>
-                <w:rFonts w:ascii="Arial" w:eastAsia="Arial" w:hAnsi="Arial"/>
-                <w:sz w:val="18"/>
-                <w:lang w:val="en-US"/>
-              </w:rPr>
-              <w:t>,</w:t>
-            </w:r>
-            <w:r>
-              <w:rPr>
-                <w:rFonts w:ascii="Arial" w:eastAsia="Arial" w:hAnsi="Arial"/>
-                <w:sz w:val="18"/>
-                <w:lang w:val="en-US"/>
-              </w:rPr>
-              <w:t>Mobil Box Kecil</w:t>
-            </w:r>
-            <w:r>
-              <w:rPr>
-                <w:rFonts w:ascii="Arial" w:eastAsia="Arial" w:hAnsi="Arial"/>
-                <w:sz w:val="18"/>
-                <w:lang w:val="en-US"/>
-              </w:rPr>
-              <w:t xml:space="preserve"> dan Pick Up Besar</w:t>
-            </w:r>
-            <w:r>
-              <w:rPr>
-                <w:rFonts w:ascii="Arial" w:eastAsia="Arial" w:hAnsi="Arial"/>
-                <w:sz w:val="18"/>
-                <w:lang w:val="en-US"/>
-              </w:rPr>
-              <w:t>)</w:t>
-            </w:r>
-          </w:p>
-        </w:tc>
-        <w:tc>
-          <w:tcPr>
-            <w:tcW w:w="1360" w:type="dxa"/>
-            <w:vAlign w:val="bottom"/>
-          </w:tcPr>
-          <w:p>
-            <w:pPr>
-              <w:spacing w:line="0" w:lineRule="atLeast"/>
-              <w:ind w:left="1060"/>
-              <w:rPr>
-                <w:rFonts w:ascii="Arial" w:eastAsia="Arial" w:hAnsi="Arial"/>
-                <w:w w:val="99"/>
-                <w:sz w:val="18"/>
-              </w:rPr>
-            </w:pPr>
-            <w:r>
-              <w:rPr>
-                <w:rFonts w:ascii="Arial" w:eastAsia="Arial" w:hAnsi="Arial"/>
-                <w:w w:val="99"/>
-                <w:sz w:val="18"/>
-              </w:rPr>
-              <w:t>Rp.</w:t>
-            </w:r>
-          </w:p>
-        </w:tc>
-        <w:tc>
-          <w:tcPr>
-            <w:tcW w:w="2560" w:type="dxa"/>
-            <w:vAlign w:val="bottom"/>
-          </w:tcPr>
-          <w:p>
-            <w:pPr>
-              <w:spacing w:line="0" w:lineRule="atLeast"/>
-              <w:ind w:right="10"/>
-              <w:jc w:val="right"/>
-              <w:rPr>
-                <w:rFonts w:ascii="Arial" w:eastAsia="Arial" w:hAnsi="Arial"/>
-                <w:sz w:val="18"/>
-                <w:lang w:val="en-US"/>
-              </w:rPr>
-            </w:pPr>
-            <w:r>
-              <w:rPr>
-                <w:rFonts w:ascii="Arial" w:eastAsia="Arial" w:hAnsi="Arial"/>
-                <w:sz w:val="18"/>
-                <w:lang w:val="en-US"/>
-              </w:rPr>
-              <w:t>0</w:t>
-            </w:r>
-          </w:p>
-        </w:tc>
-      </w:tr>
-      <w:tr>
-        <w:trPr>
-          <w:trHeight w:val="321"/>
-        </w:trPr>
-        <w:tc>
-          <w:tcPr>
-            <w:tcW w:w="480" w:type="dxa"/>
-            <w:vAlign w:val="bottom"/>
-          </w:tcPr>
-          <w:p>
-            <w:pPr>
-              <w:spacing w:line="0" w:lineRule="atLeast"/>
-              <w:jc w:val="right"/>
-              <w:rPr>
-                <w:rFonts w:ascii="Arial" w:eastAsia="Arial" w:hAnsi="Arial"/>
-                <w:sz w:val="18"/>
-              </w:rPr>
-            </w:pPr>
-            <w:r>
-              <w:rPr>
-                <w:rFonts w:ascii="Arial" w:eastAsia="Arial" w:hAnsi="Arial"/>
-                <w:sz w:val="18"/>
-              </w:rPr>
-              <w:t>23.</w:t>
-            </w:r>
-          </w:p>
-        </w:tc>
-        <w:tc>
-          <w:tcPr>
-            <w:tcW w:w="5720" w:type="dxa"/>
-            <w:vAlign w:val="bottom"/>
-          </w:tcPr>
-          <w:p>
-            <w:pPr>
-              <w:spacing w:line="0" w:lineRule="atLeast"/>
-              <w:ind w:left="60"/>
-              <w:rPr>
-                <w:rFonts w:ascii="Arial" w:eastAsia="Arial" w:hAnsi="Arial"/>
-                <w:sz w:val="18"/>
-                <w:lang w:val="en-US"/>
-              </w:rPr>
-            </w:pPr>
-            <w:r>
-              <w:rPr>
-                <w:rFonts w:ascii="Arial" w:eastAsia="Arial" w:hAnsi="Arial"/>
-                <w:sz w:val="18"/>
-                <w:lang w:val="en-US"/>
-              </w:rPr>
-              <w:t>Golongan III (Mobil Sedan, Minibus/Sejenis,Pick Up Kecil)</w:t>
-            </w:r>
-          </w:p>
-        </w:tc>
-        <w:tc>
-          <w:tcPr>
-            <w:tcW w:w="1360" w:type="dxa"/>
-            <w:vAlign w:val="bottom"/>
-          </w:tcPr>
-          <w:p>
-            <w:pPr>
-              <w:spacing w:line="0" w:lineRule="atLeast"/>
-              <w:ind w:left="1060"/>
-              <w:rPr>
-                <w:rFonts w:ascii="Arial" w:eastAsia="Arial" w:hAnsi="Arial"/>
-                <w:w w:val="99"/>
-                <w:sz w:val="18"/>
-              </w:rPr>
-            </w:pPr>
-            <w:r>
-              <w:rPr>
-                <w:rFonts w:ascii="Arial" w:eastAsia="Arial" w:hAnsi="Arial"/>
-                <w:w w:val="99"/>
-                <w:sz w:val="18"/>
-              </w:rPr>
-              <w:t>Rp.</w:t>
-            </w:r>
-          </w:p>
-        </w:tc>
-        <w:tc>
-          <w:tcPr>
-            <w:tcW w:w="2560" w:type="dxa"/>
-            <w:vAlign w:val="bottom"/>
-          </w:tcPr>
-          <w:p>
-            <w:pPr>
-              <w:spacing w:line="0" w:lineRule="atLeast"/>
-              <w:ind w:right="10"/>
-              <w:jc w:val="right"/>
-              <w:rPr>
-                <w:rFonts w:ascii="Arial" w:eastAsia="Arial" w:hAnsi="Arial"/>
-                <w:sz w:val="18"/>
-              </w:rPr>
-            </w:pPr>
-            <w:r>
-              <w:rPr>
-                <w:rFonts w:ascii="Arial" w:eastAsia="Arial" w:hAnsi="Arial"/>
-                <w:sz w:val="18"/>
-              </w:rPr>
-              <w:t>0</w:t>
-            </w:r>
-          </w:p>
-        </w:tc>
-      </w:tr>
-      <w:tr>
-        <w:trPr>
-          <w:trHeight w:val="321"/>
-        </w:trPr>
-        <w:tc>
-          <w:tcPr>
-            <w:tcW w:w="480" w:type="dxa"/>
-            <w:vAlign w:val="bottom"/>
-          </w:tcPr>
-          <w:p>
-            <w:pPr>
-              <w:spacing w:line="0" w:lineRule="atLeast"/>
-              <w:jc w:val="right"/>
-              <w:rPr>
-                <w:rFonts w:ascii="Arial" w:eastAsia="Arial" w:hAnsi="Arial"/>
-                <w:sz w:val="18"/>
-              </w:rPr>
-            </w:pPr>
-            <w:r>
-              <w:rPr>
-                <w:rFonts w:ascii="Arial" w:eastAsia="Arial" w:hAnsi="Arial"/>
-                <w:sz w:val="18"/>
-              </w:rPr>
-              <w:t>24.</w:t>
-            </w:r>
-          </w:p>
-        </w:tc>
-        <w:tc>
-          <w:tcPr>
-            <w:tcW w:w="5720" w:type="dxa"/>
-            <w:vAlign w:val="bottom"/>
-          </w:tcPr>
-          <w:p>
-            <w:pPr>
-              <w:spacing w:line="0" w:lineRule="atLeast"/>
-              <w:ind w:left="60"/>
-              <w:rPr>
-                <w:rFonts w:ascii="Arial" w:eastAsia="Arial" w:hAnsi="Arial"/>
-                <w:sz w:val="18"/>
-                <w:lang w:val="en-US"/>
-              </w:rPr>
-            </w:pPr>
-            <w:r>
-              <w:rPr>
-                <w:rFonts w:ascii="Arial" w:eastAsia="Arial" w:hAnsi="Arial"/>
-                <w:sz w:val="18"/>
-                <w:lang w:val="en-US"/>
-              </w:rPr>
-              <w:t>Sepeda Motor dan Kendaraan Roda Tiga</w:t>
-            </w:r>
-          </w:p>
-        </w:tc>
-        <w:tc>
-          <w:tcPr>
-            <w:tcW w:w="1360" w:type="dxa"/>
-            <w:vAlign w:val="bottom"/>
-          </w:tcPr>
-          <w:p>
-            <w:pPr>
-              <w:spacing w:line="0" w:lineRule="atLeast"/>
-              <w:ind w:left="1060"/>
-              <w:rPr>
-                <w:rFonts w:ascii="Arial" w:eastAsia="Arial" w:hAnsi="Arial"/>
-                <w:w w:val="99"/>
-                <w:sz w:val="18"/>
-              </w:rPr>
-            </w:pPr>
-            <w:r>
-              <w:rPr>
-                <w:rFonts w:ascii="Arial" w:eastAsia="Arial" w:hAnsi="Arial"/>
-                <w:w w:val="99"/>
-                <w:sz w:val="18"/>
-              </w:rPr>
-              <w:t>Rp.</w:t>
-            </w:r>
-          </w:p>
-        </w:tc>
-        <w:tc>
-          <w:tcPr>
-            <w:tcW w:w="2560" w:type="dxa"/>
-            <w:vAlign w:val="bottom"/>
-          </w:tcPr>
-          <w:p>
-            <w:pPr>
-              <w:spacing w:line="0" w:lineRule="atLeast"/>
-              <w:ind w:right="10"/>
-              <w:jc w:val="right"/>
-              <w:rPr>
-                <w:rFonts w:ascii="Arial" w:eastAsia="Arial" w:hAnsi="Arial"/>
-                <w:sz w:val="18"/>
-                <w:lang w:val="en-US"/>
-              </w:rPr>
-            </w:pPr>
-            <w:r>
-              <w:rPr>
-                <w:rFonts w:ascii="Arial" w:eastAsia="Arial" w:hAnsi="Arial"/>
-                <w:sz w:val="18"/>
-                <w:lang w:val="en-US"/>
-              </w:rPr>
-              <w:t>0</w:t>
-            </w:r>
-          </w:p>
-        </w:tc>
-      </w:tr>
-      <w:tr>
-        <w:trPr>
-          <w:trHeight w:val="321"/>
-        </w:trPr>
-        <w:tc>
-          <w:tcPr>
-            <w:tcW w:w="480" w:type="dxa"/>
-            <w:vAlign w:val="bottom"/>
-          </w:tcPr>
-          <w:p>
-            <w:pPr>
-              <w:spacing w:line="0" w:lineRule="atLeast"/>
-              <w:jc w:val="right"/>
-              <w:rPr>
-                <w:rFonts w:ascii="Arial" w:eastAsia="Arial" w:hAnsi="Arial"/>
-                <w:sz w:val="18"/>
-              </w:rPr>
-            </w:pPr>
-            <w:r>
-              <w:rPr>
-                <w:rFonts w:ascii="Arial" w:eastAsia="Arial" w:hAnsi="Arial"/>
-                <w:sz w:val="18"/>
-              </w:rPr>
-              <w:t>25.</w:t>
-            </w:r>
-          </w:p>
-        </w:tc>
-        <w:tc>
-          <w:tcPr>
-            <w:tcW w:w="5720" w:type="dxa"/>
-            <w:vAlign w:val="bottom"/>
-          </w:tcPr>
-          <w:p>
-            <w:pPr>
-              <w:spacing w:line="0" w:lineRule="atLeast"/>
-              <w:ind w:left="60"/>
-              <w:rPr>
-                <w:rFonts w:ascii="Arial" w:eastAsia="Arial" w:hAnsi="Arial"/>
-                <w:sz w:val="18"/>
-                <w:lang w:val="en-US"/>
-              </w:rPr>
-            </w:pPr>
-            <w:r>
-              <w:rPr>
-                <w:rFonts w:ascii="Arial" w:eastAsia="Arial" w:hAnsi="Arial"/>
-                <w:sz w:val="18"/>
-                <w:lang w:val="en-US"/>
-              </w:rPr>
-              <w:t>Sepeda</w:t>
-            </w:r>
-          </w:p>
-        </w:tc>
-        <w:tc>
-          <w:tcPr>
-            <w:tcW w:w="1360" w:type="dxa"/>
-            <w:vAlign w:val="bottom"/>
-          </w:tcPr>
-          <w:p>
-            <w:pPr>
-              <w:spacing w:line="0" w:lineRule="atLeast"/>
-              <w:ind w:left="1060"/>
-              <w:rPr>
-                <w:rFonts w:ascii="Arial" w:eastAsia="Arial" w:hAnsi="Arial"/>
-                <w:w w:val="99"/>
-                <w:sz w:val="18"/>
-              </w:rPr>
-            </w:pPr>
-            <w:r>
-              <w:rPr>
-                <w:rFonts w:ascii="Arial" w:eastAsia="Arial" w:hAnsi="Arial"/>
-                <w:w w:val="99"/>
-                <w:sz w:val="18"/>
-              </w:rPr>
-              <w:t>Rp.</w:t>
-            </w:r>
-          </w:p>
-        </w:tc>
-        <w:tc>
-          <w:tcPr>
-            <w:tcW w:w="2560" w:type="dxa"/>
-            <w:vAlign w:val="bottom"/>
-          </w:tcPr>
-          <w:p>
-            <w:pPr>
-              <w:spacing w:line="0" w:lineRule="atLeast"/>
-              <w:ind w:right="10"/>
-              <w:jc w:val="right"/>
-              <w:rPr>
-                <w:rFonts w:ascii="Arial" w:eastAsia="Arial" w:hAnsi="Arial"/>
-                <w:sz w:val="18"/>
-                <w:lang w:val="en-US"/>
-              </w:rPr>
-            </w:pPr>
-            <w:r>
-              <w:rPr>
-                <w:rFonts w:ascii="Arial" w:eastAsia="Arial" w:hAnsi="Arial"/>
-                <w:sz w:val="18"/>
-                <w:lang w:val="en-US"/>
-              </w:rPr>
-              <w:t xml:space="preserve">0        </w:t>
             </w:r>
           </w:p>
         </w:tc>
@@ -4445,26 +3834,13 @@
           <w:sz w:val="18"/>
           <w:lang w:val="en-US"/>
         </w:rPr>
-        <w:t xml:space="preserve"> </w:t>
-      </w:r>
-      <w:r>
-        <w:rPr>
-          <w:rFonts w:ascii="Arial" w:eastAsia="Arial" w:hAnsi="Arial"/>
-          <w:sz w:val="18"/>
-          <w:lang w:val="en-US"/>
-        </w:rPr>
-        <w:t>Afriana Pulungan, S.Si., M.AP.</w:t>
+        <w:t xml:space="preserve"> Afriana Pulungan, S.Si., M.AP.</w:t>
       </w:r>
       <w:r>
         <w:rPr>
           <w:rFonts w:ascii="Times New Roman" w:eastAsia="Times New Roman" w:hAnsi="Times New Roman"/>
         </w:rPr>
         <w:tab/>
-      </w:r>
-      <w:r>
-        <w:rPr>
-          <w:rFonts w:ascii="Times New Roman" w:eastAsia="Times New Roman" w:hAnsi="Times New Roman"/>
-        </w:rPr>
         <w:t xml:space="preserve">         </w:t>
       </w:r>
       <w:r>

</xml_diff>

<commit_message>
feat: pembaruan format matriks laporan pemakaian tempat dan fasilitas sesuai acuan resmi
</commit_message>
<xml_diff>
--- a/format-new-pemasaran (1).docx
+++ b/format-new-pemasaran (1).docx
@@ -813,7 +813,27 @@
                 <w:sz w:val="18"/>
                 <w:lang w:val="en-US"/>
               </w:rPr>
-              <w:t xml:space="preserve">4.1.02.02.12.0001  </w:t>
+              <w:t>4.1.02.02.12.00</w:t>
+            </w:r>
+            <w:r>
+              <w:rPr>
+                <w:rFonts w:ascii="Arial" w:eastAsia="Arial" w:hAnsi="Arial"/>
+                <w:b/>
+                <w:bCs/>
+                <w:sz w:val="18"/>
+                <w:lang w:val="en-US"/>
+              </w:rPr>
+              <w:t>0</w:t>
+            </w:r>
+            <w:r>
+              <w:rPr>
+                <w:rFonts w:ascii="Arial" w:eastAsia="Arial" w:hAnsi="Arial"/>
+                <w:b/>
+                <w:bCs/>
+                <w:sz w:val="18"/>
+                <w:lang w:val="en-US"/>
+              </w:rPr>
+              <w:t xml:space="preserve">01  </w:t>
             </w:r>
             <w:r>
               <w:rPr>
@@ -861,7 +881,7 @@
                 <w:rFonts w:ascii="Arial" w:eastAsia="Arial" w:hAnsi="Arial"/>
                 <w:sz w:val="18"/>
               </w:rPr>
-              <w:t>18.</w:t>
+              <w:t>1.</w:t>
             </w:r>
           </w:p>
         </w:tc>
@@ -985,7 +1005,14 @@
                 <w:rFonts w:ascii="Arial" w:eastAsia="Arial" w:hAnsi="Arial"/>
                 <w:sz w:val="18"/>
               </w:rPr>
-              <w:t>19.</w:t>
+              <w:t>2</w:t>
+            </w:r>
+            <w:r>
+              <w:rPr>
+                <w:rFonts w:ascii="Arial" w:eastAsia="Arial" w:hAnsi="Arial"/>
+                <w:sz w:val="18"/>
+              </w:rPr>
+              <w:t>.</w:t>
             </w:r>
           </w:p>
         </w:tc>
@@ -1087,7 +1114,14 @@
                 <w:rFonts w:ascii="Arial" w:eastAsia="Arial" w:hAnsi="Arial"/>
                 <w:sz w:val="18"/>
               </w:rPr>
-              <w:t>20.</w:t>
+              <w:t>3</w:t>
+            </w:r>
+            <w:r>
+              <w:rPr>
+                <w:rFonts w:ascii="Arial" w:eastAsia="Arial" w:hAnsi="Arial"/>
+                <w:sz w:val="18"/>
+              </w:rPr>
+              <w:t>.</w:t>
             </w:r>
           </w:p>
         </w:tc>
@@ -1170,7 +1204,7 @@
       </w:tr>
       <w:tr>
         <w:trPr>
-          <w:trHeight w:val="707"/>
+          <w:trHeight w:val="311"/>
         </w:trPr>
         <w:tc>
           <w:tcPr>
@@ -1198,7 +1232,7 @@
                 <w:sz w:val="18"/>
                 <w:lang w:val="en-US"/>
               </w:rPr>
-              <w:t xml:space="preserve">4.1.02.02.20.0001  </w:t>
+              <w:t>4.1.02.02.20.000</w:t>
             </w:r>
             <w:r>
               <w:rPr>
@@ -1208,7 +1242,7 @@
                 <w:sz w:val="18"/>
                 <w:lang w:val="en-US"/>
               </w:rPr>
-              <w:t>Retribusi Pemanfaatan Aset Daerah yang Tidak Menganggu Penyelengaraan Tugas dan fungsi Organisasi Perangkat D</w:t>
+              <w:t>0</w:t>
             </w:r>
             <w:r>
               <w:rPr>
@@ -1218,7 +1252,7 @@
                 <w:sz w:val="18"/>
                 <w:lang w:val="en-US"/>
               </w:rPr>
-              <w:t xml:space="preserve">aerah </w:t>
+              <w:t xml:space="preserve">1  </w:t>
             </w:r>
             <w:r>
               <w:rPr>
@@ -1228,57 +1262,7 @@
                 <w:sz w:val="18"/>
                 <w:lang w:val="en-US"/>
               </w:rPr>
-              <w:t>dan/atau Optimalisasi Aset D</w:t>
-            </w:r>
-            <w:r>
-              <w:rPr>
-                <w:rFonts w:ascii="Arial" w:eastAsia="Arial" w:hAnsi="Arial"/>
-                <w:b/>
-                <w:bCs/>
-                <w:sz w:val="18"/>
-                <w:lang w:val="en-US"/>
-              </w:rPr>
-              <w:t>aerah d</w:t>
-            </w:r>
-            <w:r>
-              <w:rPr>
-                <w:rFonts w:ascii="Arial" w:eastAsia="Arial" w:hAnsi="Arial"/>
-                <w:b/>
-                <w:bCs/>
-                <w:sz w:val="18"/>
-                <w:lang w:val="en-US"/>
-              </w:rPr>
-              <w:t>engan Tidak Mengubah S</w:t>
-            </w:r>
-            <w:r>
-              <w:rPr>
-                <w:rFonts w:ascii="Arial" w:eastAsia="Arial" w:hAnsi="Arial"/>
-                <w:b/>
-                <w:bCs/>
-                <w:sz w:val="18"/>
-                <w:lang w:val="en-US"/>
-              </w:rPr>
-              <w:t>t</w:t>
-            </w:r>
-            <w:r>
-              <w:rPr>
-                <w:rFonts w:ascii="Arial" w:eastAsia="Arial" w:hAnsi="Arial"/>
-                <w:b/>
-                <w:bCs/>
-                <w:sz w:val="18"/>
-                <w:lang w:val="en-US"/>
-              </w:rPr>
-              <w:t>atus Kepemilikan Sesuai dengan Ketentuan Peraturan P</w:t>
-            </w:r>
-            <w:r>
-              <w:rPr>
-                <w:rFonts w:ascii="Arial" w:eastAsia="Arial" w:hAnsi="Arial"/>
-                <w:b/>
-                <w:bCs/>
-                <w:sz w:val="18"/>
-                <w:lang w:val="en-US"/>
-              </w:rPr>
-              <w:t>erundang-undangan</w:t>
+              <w:t xml:space="preserve">Retribusi Pemanfaatan Aset Daerah </w:t>
             </w:r>
           </w:p>
         </w:tc>
@@ -1306,7 +1290,14 @@
                 <w:rFonts w:ascii="Arial" w:eastAsia="Arial" w:hAnsi="Arial"/>
                 <w:sz w:val="18"/>
               </w:rPr>
-              <w:t>26.</w:t>
+              <w:t>4</w:t>
+            </w:r>
+            <w:r>
+              <w:rPr>
+                <w:rFonts w:ascii="Arial" w:eastAsia="Arial" w:hAnsi="Arial"/>
+                <w:sz w:val="18"/>
+              </w:rPr>
+              <w:t>.</w:t>
             </w:r>
           </w:p>
         </w:tc>
@@ -1415,7 +1406,14 @@
                 <w:rFonts w:ascii="Arial" w:eastAsia="Arial" w:hAnsi="Arial"/>
                 <w:sz w:val="18"/>
               </w:rPr>
-              <w:t>27.</w:t>
+              <w:t>5</w:t>
+            </w:r>
+            <w:r>
+              <w:rPr>
+                <w:rFonts w:ascii="Arial" w:eastAsia="Arial" w:hAnsi="Arial"/>
+                <w:sz w:val="18"/>
+              </w:rPr>
+              <w:t>.</w:t>
             </w:r>
           </w:p>
         </w:tc>
@@ -1526,7 +1524,14 @@
                 <w:rFonts w:ascii="Arial" w:eastAsia="Arial" w:hAnsi="Arial"/>
                 <w:sz w:val="18"/>
               </w:rPr>
-              <w:t>28.</w:t>
+              <w:t>6</w:t>
+            </w:r>
+            <w:r>
+              <w:rPr>
+                <w:rFonts w:ascii="Arial" w:eastAsia="Arial" w:hAnsi="Arial"/>
+                <w:sz w:val="18"/>
+              </w:rPr>
+              <w:t>.</w:t>
             </w:r>
           </w:p>
         </w:tc>
@@ -1635,7 +1640,14 @@
                 <w:rFonts w:ascii="Arial" w:eastAsia="Arial" w:hAnsi="Arial"/>
                 <w:sz w:val="18"/>
               </w:rPr>
-              <w:t>29.</w:t>
+              <w:t>7</w:t>
+            </w:r>
+            <w:r>
+              <w:rPr>
+                <w:rFonts w:ascii="Arial" w:eastAsia="Arial" w:hAnsi="Arial"/>
+                <w:sz w:val="18"/>
+              </w:rPr>
+              <w:t>.</w:t>
             </w:r>
           </w:p>
         </w:tc>
@@ -1737,7 +1749,14 @@
                 <w:rFonts w:ascii="Arial" w:eastAsia="Arial" w:hAnsi="Arial"/>
                 <w:sz w:val="18"/>
               </w:rPr>
-              <w:t>30.</w:t>
+              <w:t>8</w:t>
+            </w:r>
+            <w:r>
+              <w:rPr>
+                <w:rFonts w:ascii="Arial" w:eastAsia="Arial" w:hAnsi="Arial"/>
+                <w:sz w:val="18"/>
+              </w:rPr>
+              <w:t>.</w:t>
             </w:r>
           </w:p>
         </w:tc>
@@ -1841,7 +1860,14 @@
                 <w:rFonts w:ascii="Arial" w:eastAsia="Arial" w:hAnsi="Arial"/>
                 <w:sz w:val="18"/>
               </w:rPr>
-              <w:t>31.</w:t>
+              <w:t>9</w:t>
+            </w:r>
+            <w:r>
+              <w:rPr>
+                <w:rFonts w:ascii="Arial" w:eastAsia="Arial" w:hAnsi="Arial"/>
+                <w:sz w:val="18"/>
+              </w:rPr>
+              <w:t>.</w:t>
             </w:r>
           </w:p>
         </w:tc>
@@ -1943,7 +1969,14 @@
                 <w:rFonts w:ascii="Arial" w:eastAsia="Arial" w:hAnsi="Arial"/>
                 <w:sz w:val="18"/>
               </w:rPr>
-              <w:t>32.</w:t>
+              <w:t>10</w:t>
+            </w:r>
+            <w:r>
+              <w:rPr>
+                <w:rFonts w:ascii="Arial" w:eastAsia="Arial" w:hAnsi="Arial"/>
+                <w:sz w:val="18"/>
+              </w:rPr>
+              <w:t>.</w:t>
             </w:r>
           </w:p>
         </w:tc>
@@ -2063,7 +2096,14 @@
                 <w:rFonts w:ascii="Arial" w:eastAsia="Arial" w:hAnsi="Arial"/>
                 <w:sz w:val="18"/>
               </w:rPr>
-              <w:t>33.</w:t>
+              <w:t>11</w:t>
+            </w:r>
+            <w:r>
+              <w:rPr>
+                <w:rFonts w:ascii="Arial" w:eastAsia="Arial" w:hAnsi="Arial"/>
+                <w:sz w:val="18"/>
+              </w:rPr>
+              <w:t>.</w:t>
             </w:r>
           </w:p>
         </w:tc>
@@ -2167,7 +2207,14 @@
                 <w:rFonts w:ascii="Arial" w:eastAsia="Arial" w:hAnsi="Arial"/>
                 <w:sz w:val="18"/>
               </w:rPr>
-              <w:t>34.</w:t>
+              <w:t>12</w:t>
+            </w:r>
+            <w:r>
+              <w:rPr>
+                <w:rFonts w:ascii="Arial" w:eastAsia="Arial" w:hAnsi="Arial"/>
+                <w:sz w:val="18"/>
+              </w:rPr>
+              <w:t>.</w:t>
             </w:r>
           </w:p>
         </w:tc>
@@ -2278,7 +2325,14 @@
                 <w:rFonts w:ascii="Arial" w:eastAsia="Arial" w:hAnsi="Arial"/>
                 <w:sz w:val="18"/>
               </w:rPr>
-              <w:t>35.</w:t>
+              <w:t>13</w:t>
+            </w:r>
+            <w:r>
+              <w:rPr>
+                <w:rFonts w:ascii="Arial" w:eastAsia="Arial" w:hAnsi="Arial"/>
+                <w:sz w:val="18"/>
+              </w:rPr>
+              <w:t>.</w:t>
             </w:r>
           </w:p>
         </w:tc>
@@ -2387,7 +2441,14 @@
                 <w:rFonts w:ascii="Arial" w:eastAsia="Arial" w:hAnsi="Arial"/>
                 <w:sz w:val="18"/>
               </w:rPr>
-              <w:t>36.</w:t>
+              <w:t>14</w:t>
+            </w:r>
+            <w:r>
+              <w:rPr>
+                <w:rFonts w:ascii="Arial" w:eastAsia="Arial" w:hAnsi="Arial"/>
+                <w:sz w:val="18"/>
+              </w:rPr>
+              <w:t>.</w:t>
             </w:r>
           </w:p>
         </w:tc>
@@ -2489,7 +2550,14 @@
                 <w:rFonts w:ascii="Arial" w:eastAsia="Arial" w:hAnsi="Arial"/>
                 <w:sz w:val="18"/>
               </w:rPr>
-              <w:t>37.</w:t>
+              <w:t>15</w:t>
+            </w:r>
+            <w:r>
+              <w:rPr>
+                <w:rFonts w:ascii="Arial" w:eastAsia="Arial" w:hAnsi="Arial"/>
+                <w:sz w:val="18"/>
+              </w:rPr>
+              <w:t>.</w:t>
             </w:r>
           </w:p>
         </w:tc>
@@ -2605,7 +2673,14 @@
                 <w:rFonts w:ascii="Arial" w:eastAsia="Arial" w:hAnsi="Arial"/>
                 <w:sz w:val="18"/>
               </w:rPr>
-              <w:t>38.</w:t>
+              <w:t>16</w:t>
+            </w:r>
+            <w:r>
+              <w:rPr>
+                <w:rFonts w:ascii="Arial" w:eastAsia="Arial" w:hAnsi="Arial"/>
+                <w:sz w:val="18"/>
+              </w:rPr>
+              <w:t>.</w:t>
             </w:r>
           </w:p>
         </w:tc>
@@ -2707,7 +2782,14 @@
                 <w:rFonts w:ascii="Arial" w:eastAsia="Arial" w:hAnsi="Arial"/>
                 <w:sz w:val="18"/>
               </w:rPr>
-              <w:t>39.</w:t>
+              <w:t>17</w:t>
+            </w:r>
+            <w:r>
+              <w:rPr>
+                <w:rFonts w:ascii="Arial" w:eastAsia="Arial" w:hAnsi="Arial"/>
+                <w:sz w:val="18"/>
+              </w:rPr>
+              <w:t>.</w:t>
             </w:r>
           </w:p>
         </w:tc>
@@ -2809,7 +2891,14 @@
                 <w:rFonts w:ascii="Arial" w:eastAsia="Arial" w:hAnsi="Arial"/>
                 <w:sz w:val="18"/>
               </w:rPr>
-              <w:t>40.</w:t>
+              <w:t>18</w:t>
+            </w:r>
+            <w:r>
+              <w:rPr>
+                <w:rFonts w:ascii="Arial" w:eastAsia="Arial" w:hAnsi="Arial"/>
+                <w:sz w:val="18"/>
+              </w:rPr>
+              <w:t>.</w:t>
             </w:r>
           </w:p>
         </w:tc>
@@ -2911,7 +3000,14 @@
                 <w:rFonts w:ascii="Arial" w:eastAsia="Arial" w:hAnsi="Arial"/>
                 <w:sz w:val="18"/>
               </w:rPr>
-              <w:t>41.</w:t>
+              <w:t>19</w:t>
+            </w:r>
+            <w:r>
+              <w:rPr>
+                <w:rFonts w:ascii="Arial" w:eastAsia="Arial" w:hAnsi="Arial"/>
+                <w:sz w:val="18"/>
+              </w:rPr>
+              <w:t>.</w:t>
             </w:r>
           </w:p>
         </w:tc>
@@ -3013,7 +3109,14 @@
                 <w:rFonts w:ascii="Arial" w:eastAsia="Arial" w:hAnsi="Arial"/>
                 <w:sz w:val="18"/>
               </w:rPr>
-              <w:t>42.</w:t>
+              <w:t>20</w:t>
+            </w:r>
+            <w:r>
+              <w:rPr>
+                <w:rFonts w:ascii="Arial" w:eastAsia="Arial" w:hAnsi="Arial"/>
+                <w:sz w:val="18"/>
+              </w:rPr>
+              <w:t>.</w:t>
             </w:r>
           </w:p>
         </w:tc>
@@ -3115,7 +3218,14 @@
                 <w:rFonts w:ascii="Arial" w:eastAsia="Arial" w:hAnsi="Arial"/>
                 <w:sz w:val="18"/>
               </w:rPr>
-              <w:t>43.</w:t>
+              <w:t>21</w:t>
+            </w:r>
+            <w:r>
+              <w:rPr>
+                <w:rFonts w:ascii="Arial" w:eastAsia="Arial" w:hAnsi="Arial"/>
+                <w:sz w:val="18"/>
+              </w:rPr>
+              <w:t>.</w:t>
             </w:r>
           </w:p>
         </w:tc>
@@ -3217,7 +3327,14 @@
                 <w:rFonts w:ascii="Arial" w:eastAsia="Arial" w:hAnsi="Arial"/>
                 <w:sz w:val="18"/>
               </w:rPr>
-              <w:t>44.</w:t>
+              <w:t>22</w:t>
+            </w:r>
+            <w:r>
+              <w:rPr>
+                <w:rFonts w:ascii="Arial" w:eastAsia="Arial" w:hAnsi="Arial"/>
+                <w:sz w:val="18"/>
+              </w:rPr>
+              <w:t>.</w:t>
             </w:r>
           </w:p>
         </w:tc>
@@ -3333,7 +3450,14 @@
                 <w:rFonts w:ascii="Arial" w:eastAsia="Arial" w:hAnsi="Arial"/>
                 <w:sz w:val="18"/>
               </w:rPr>
-              <w:t>45.</w:t>
+              <w:t>23</w:t>
+            </w:r>
+            <w:r>
+              <w:rPr>
+                <w:rFonts w:ascii="Arial" w:eastAsia="Arial" w:hAnsi="Arial"/>
+                <w:sz w:val="18"/>
+              </w:rPr>
+              <w:t>.</w:t>
             </w:r>
           </w:p>
         </w:tc>

</xml_diff>